<commit_message>
Prep for Meeting 7/5
Create task list, slightly adjust code naming convention to make more sense.

Add correct Label/TextureRects to arrays in ASL_Quiz_UI

Adjusted comments to correctly explain ASL_Quiz_UI func and variables.

Adjusted image buttons and meaning buttons in ASL_Quiz_UI to run answer_picked(String) with corresponding player selection.

added StaticBody2D to newspaper and Tree w/ CollisionShape2D.
</commit_message>
<xml_diff>
--- a/Week 4/Skeleton_Code_Change_Suggestions.docx
+++ b/Week 4/Skeleton_Code_Change_Suggestions.docx
@@ -50,12 +50,14 @@
           <w:numId w:val="2"/>
         </w:numPr>
         <w:rPr>
-          <w:sz w:val="44"/>
-          <w:szCs w:val="44"/>
-        </w:rPr>
-      </w:pPr>
-      <w:r>
-        <w:rPr>
+          <w:color w:val="4EA72E" w:themeColor="accent6"/>
+          <w:sz w:val="44"/>
+          <w:szCs w:val="44"/>
+        </w:rPr>
+      </w:pPr>
+      <w:r>
+        <w:rPr>
+          <w:color w:val="4EA72E" w:themeColor="accent6"/>
           <w:sz w:val="44"/>
           <w:szCs w:val="44"/>
         </w:rPr>
@@ -70,12 +72,14 @@
           <w:numId w:val="2"/>
         </w:numPr>
         <w:rPr>
-          <w:sz w:val="44"/>
-          <w:szCs w:val="44"/>
-        </w:rPr>
-      </w:pPr>
-      <w:r>
-        <w:rPr>
+          <w:color w:val="4EA72E" w:themeColor="accent6"/>
+          <w:sz w:val="44"/>
+          <w:szCs w:val="44"/>
+        </w:rPr>
+      </w:pPr>
+      <w:r>
+        <w:rPr>
+          <w:color w:val="4EA72E" w:themeColor="accent6"/>
           <w:sz w:val="44"/>
           <w:szCs w:val="44"/>
         </w:rPr>
@@ -84,6 +88,7 @@
       <w:proofErr w:type="spellStart"/>
       <w:r>
         <w:rPr>
+          <w:color w:val="4EA72E" w:themeColor="accent6"/>
           <w:sz w:val="44"/>
           <w:szCs w:val="44"/>
         </w:rPr>
@@ -92,6 +97,7 @@
       <w:proofErr w:type="spellEnd"/>
       <w:r>
         <w:rPr>
+          <w:color w:val="4EA72E" w:themeColor="accent6"/>
           <w:sz w:val="44"/>
           <w:szCs w:val="44"/>
         </w:rPr>
@@ -106,12 +112,14 @@
           <w:numId w:val="2"/>
         </w:numPr>
         <w:rPr>
-          <w:sz w:val="44"/>
-          <w:szCs w:val="44"/>
-        </w:rPr>
-      </w:pPr>
-      <w:r>
-        <w:rPr>
+          <w:color w:val="4EA72E" w:themeColor="accent6"/>
+          <w:sz w:val="44"/>
+          <w:szCs w:val="44"/>
+        </w:rPr>
+      </w:pPr>
+      <w:r>
+        <w:rPr>
+          <w:color w:val="4EA72E" w:themeColor="accent6"/>
           <w:sz w:val="44"/>
           <w:szCs w:val="44"/>
         </w:rPr>
@@ -126,12 +134,14 @@
           <w:numId w:val="2"/>
         </w:numPr>
         <w:rPr>
-          <w:sz w:val="44"/>
-          <w:szCs w:val="44"/>
-        </w:rPr>
-      </w:pPr>
-      <w:r>
-        <w:rPr>
+          <w:color w:val="4EA72E" w:themeColor="accent6"/>
+          <w:sz w:val="44"/>
+          <w:szCs w:val="44"/>
+        </w:rPr>
+      </w:pPr>
+      <w:r>
+        <w:rPr>
+          <w:color w:val="4EA72E" w:themeColor="accent6"/>
           <w:sz w:val="44"/>
           <w:szCs w:val="44"/>
         </w:rPr>
@@ -146,12 +156,14 @@
           <w:numId w:val="2"/>
         </w:numPr>
         <w:rPr>
-          <w:sz w:val="44"/>
-          <w:szCs w:val="44"/>
-        </w:rPr>
-      </w:pPr>
-      <w:r>
-        <w:rPr>
+          <w:color w:val="4EA72E" w:themeColor="accent6"/>
+          <w:sz w:val="44"/>
+          <w:szCs w:val="44"/>
+        </w:rPr>
+      </w:pPr>
+      <w:r>
+        <w:rPr>
+          <w:color w:val="4EA72E" w:themeColor="accent6"/>
           <w:sz w:val="44"/>
           <w:szCs w:val="44"/>
         </w:rPr>
@@ -166,12 +178,14 @@
           <w:numId w:val="2"/>
         </w:numPr>
         <w:rPr>
-          <w:sz w:val="44"/>
-          <w:szCs w:val="44"/>
-        </w:rPr>
-      </w:pPr>
-      <w:r>
-        <w:rPr>
+          <w:color w:val="4EA72E" w:themeColor="accent6"/>
+          <w:sz w:val="44"/>
+          <w:szCs w:val="44"/>
+        </w:rPr>
+      </w:pPr>
+      <w:r>
+        <w:rPr>
+          <w:color w:val="4EA72E" w:themeColor="accent6"/>
           <w:sz w:val="44"/>
           <w:szCs w:val="44"/>
         </w:rPr>
@@ -186,12 +200,14 @@
           <w:numId w:val="2"/>
         </w:numPr>
         <w:rPr>
-          <w:sz w:val="44"/>
-          <w:szCs w:val="44"/>
-        </w:rPr>
-      </w:pPr>
-      <w:r>
-        <w:rPr>
+          <w:color w:val="4EA72E" w:themeColor="accent6"/>
+          <w:sz w:val="44"/>
+          <w:szCs w:val="44"/>
+        </w:rPr>
+      </w:pPr>
+      <w:r>
+        <w:rPr>
+          <w:color w:val="4EA72E" w:themeColor="accent6"/>
           <w:sz w:val="44"/>
           <w:szCs w:val="44"/>
         </w:rPr>
@@ -201,6 +217,7 @@
       <w:proofErr w:type="spellStart"/>
       <w:r>
         <w:rPr>
+          <w:color w:val="4EA72E" w:themeColor="accent6"/>
           <w:sz w:val="44"/>
           <w:szCs w:val="44"/>
         </w:rPr>
@@ -209,6 +226,7 @@
       <w:proofErr w:type="spellEnd"/>
       <w:r>
         <w:rPr>
+          <w:color w:val="4EA72E" w:themeColor="accent6"/>
           <w:sz w:val="44"/>
           <w:szCs w:val="44"/>
         </w:rPr>
@@ -223,12 +241,14 @@
           <w:numId w:val="2"/>
         </w:numPr>
         <w:rPr>
-          <w:sz w:val="44"/>
-          <w:szCs w:val="44"/>
-        </w:rPr>
-      </w:pPr>
-      <w:r>
-        <w:rPr>
+          <w:color w:val="4EA72E" w:themeColor="accent6"/>
+          <w:sz w:val="44"/>
+          <w:szCs w:val="44"/>
+        </w:rPr>
+      </w:pPr>
+      <w:r>
+        <w:rPr>
+          <w:color w:val="4EA72E" w:themeColor="accent6"/>
           <w:sz w:val="44"/>
           <w:szCs w:val="44"/>
         </w:rPr>
@@ -237,6 +257,7 @@
       <w:proofErr w:type="gramStart"/>
       <w:r>
         <w:rPr>
+          <w:color w:val="4EA72E" w:themeColor="accent6"/>
           <w:sz w:val="44"/>
           <w:szCs w:val="44"/>
         </w:rPr>
@@ -245,6 +266,7 @@
       <w:proofErr w:type="gramEnd"/>
       <w:r>
         <w:rPr>
+          <w:color w:val="4EA72E" w:themeColor="accent6"/>
           <w:sz w:val="44"/>
           <w:szCs w:val="44"/>
         </w:rPr>
@@ -259,12 +281,14 @@
           <w:numId w:val="2"/>
         </w:numPr>
         <w:rPr>
-          <w:sz w:val="44"/>
-          <w:szCs w:val="44"/>
-        </w:rPr>
-      </w:pPr>
-      <w:r>
-        <w:rPr>
+          <w:color w:val="4EA72E" w:themeColor="accent6"/>
+          <w:sz w:val="44"/>
+          <w:szCs w:val="44"/>
+        </w:rPr>
+      </w:pPr>
+      <w:r>
+        <w:rPr>
+          <w:color w:val="4EA72E" w:themeColor="accent6"/>
           <w:sz w:val="44"/>
           <w:szCs w:val="44"/>
         </w:rPr>
@@ -279,12 +303,14 @@
           <w:numId w:val="2"/>
         </w:numPr>
         <w:rPr>
-          <w:sz w:val="44"/>
-          <w:szCs w:val="44"/>
-        </w:rPr>
-      </w:pPr>
-      <w:r>
-        <w:rPr>
+          <w:color w:val="4EA72E" w:themeColor="accent6"/>
+          <w:sz w:val="44"/>
+          <w:szCs w:val="44"/>
+        </w:rPr>
+      </w:pPr>
+      <w:r>
+        <w:rPr>
+          <w:color w:val="4EA72E" w:themeColor="accent6"/>
           <w:sz w:val="44"/>
           <w:szCs w:val="44"/>
         </w:rPr>
@@ -299,12 +325,14 @@
           <w:numId w:val="2"/>
         </w:numPr>
         <w:rPr>
-          <w:sz w:val="44"/>
-          <w:szCs w:val="44"/>
-        </w:rPr>
-      </w:pPr>
-      <w:r>
-        <w:rPr>
+          <w:color w:val="4EA72E" w:themeColor="accent6"/>
+          <w:sz w:val="44"/>
+          <w:szCs w:val="44"/>
+        </w:rPr>
+      </w:pPr>
+      <w:r>
+        <w:rPr>
+          <w:color w:val="4EA72E" w:themeColor="accent6"/>
           <w:sz w:val="44"/>
           <w:szCs w:val="44"/>
         </w:rPr>
@@ -312,6 +340,7 @@
       </w:r>
       <w:r>
         <w:rPr>
+          <w:color w:val="4EA72E" w:themeColor="accent6"/>
           <w:sz w:val="44"/>
           <w:szCs w:val="44"/>
         </w:rPr>
@@ -327,12 +356,14 @@
           <w:numId w:val="2"/>
         </w:numPr>
         <w:rPr>
-          <w:sz w:val="44"/>
-          <w:szCs w:val="44"/>
-        </w:rPr>
-      </w:pPr>
-      <w:r>
-        <w:rPr>
+          <w:color w:val="4EA72E" w:themeColor="accent6"/>
+          <w:sz w:val="44"/>
+          <w:szCs w:val="44"/>
+        </w:rPr>
+      </w:pPr>
+      <w:r>
+        <w:rPr>
+          <w:color w:val="4EA72E" w:themeColor="accent6"/>
           <w:sz w:val="44"/>
           <w:szCs w:val="44"/>
         </w:rPr>

</xml_diff>